<commit_message>
docs: 3-minute pitch leads with the 2024 holdout, adds live-demo cues, judge-track map and follow-up answers
</commit_message>
<xml_diff>
--- a/docs/pitch/PathPro_pitches.docx
+++ b/docs/pitch/PathPro_pitches.docx
@@ -66,7 +66,7 @@
           <w:sz w:val="20"/>
           <w:szCs w:val="20"/>
         </w:rPr>
-        <w:t xml:space="preserve">About 470 spoken words (3 minutes at a brisk pace). Every number comes from docs/metrics.json or the live app.</w:t>
+        <w:t xml:space="preserve">About 445 spoken words, 3:00 at a steady 150 words a minute. Built to win: the difference from crime-score apps comes in the first 15 seconds, the holdout result by 0:30, and a live demo in the middle. Every number is in docs/metrics.json or the live app.</w:t>
       </w:r>
     </w:p>
     <w:p>
@@ -80,7 +80,7 @@
         <w:t xml:space="preserve">0:00  </w:t>
       </w:r>
       <w:r>
-        <w:t xml:space="preserve">Hook</w:t>
+        <w:t xml:space="preserve">Hook: the one line that sets PathPro apart</w:t>
       </w:r>
     </w:p>
     <w:p>
@@ -88,7 +88,25 @@
         <w:spacing w:after="120" w:line="300"/>
       </w:pPr>
       <w:r>
-        <w:t xml:space="preserve">Every night, students walk out of Klaus toward Tech Square and Midtown MARTA. Every map app tells them one thing: the fastest way. Nobody tells them which of those streets is where people actually get hit. I’m Nagur Shareef Shaik, and I built PathPro, solo, to show you the risks on your way, before you go.</w:t>
+        <w:t xml:space="preserve">Every map app answers one question: what’s fastest? Most safety apps score crime with a formula someone wrote. Neither tells you where people on foot actually get hit by cars.</w:t>
+      </w:r>
+    </w:p>
+    <w:p>
+      <w:pPr>
+        <w:spacing w:after="120" w:line="300"/>
+      </w:pPr>
+      <w:r>
+        <w:t xml:space="preserve">PathPro does. It forecasts pedestrian traffic risk on all 50,000 streets in Atlanta, hour by hour, and </w:t>
+      </w:r>
+      <w:r>
+        <w:rPr>
+          <w:b/>
+          <w:bCs/>
+        </w:rPr>
+        <w:t xml:space="preserve">I tested it on a full year of crashes the model never saw.</w:t>
+      </w:r>
+      <w:r>
+        <w:t xml:space="preserve"> I’m Nagur Shareef Shaik, and I built it solo.</w:t>
       </w:r>
     </w:p>
     <w:p>
@@ -102,7 +120,35 @@
         <w:t xml:space="preserve">0:20  </w:t>
       </w:r>
       <w:r>
-        <w:t xml:space="preserve">Data</w:t>
+        <w:t xml:space="preserve">The proof, up front</w:t>
+      </w:r>
+    </w:p>
+    <w:p>
+      <w:pPr>
+        <w:spacing w:after="80"/>
+        <w:ind w:left="284"/>
+      </w:pPr>
+      <w:r>
+        <w:rPr>
+          <w:b/>
+          <w:bCs/>
+          <w:i/>
+          <w:iCs/>
+          <w:color w:val="1F8F86"/>
+          <w:sz w:val="20"/>
+          <w:szCs w:val="20"/>
+        </w:rPr>
+        <w:t xml:space="preserve">Screen: </w:t>
+      </w:r>
+      <w:r>
+        <w:rPr>
+          <w:i/>
+          <w:iCs/>
+          <w:color w:val="1F8F86"/>
+          <w:sz w:val="20"/>
+          <w:szCs w:val="20"/>
+        </w:rPr>
+        <w:t xml:space="preserve">open How PathPro works (the i button); its “How well it works” paragraph shows these numbers. Or hold up the numbers sheet in Appendix B.</w:t>
       </w:r>
     </w:p>
     <w:p>
@@ -110,37 +156,25 @@
         <w:spacing w:after="120" w:line="300"/>
       </w:pPr>
       <w:r>
-        <w:t xml:space="preserve">I pulled about </w:t>
-      </w:r>
-      <w:r>
-        <w:rPr>
-          <w:b/>
-          <w:bCs/>
-        </w:rPr>
-        <w:t xml:space="preserve">250,000 public crash records from eight sources</w:t>
-      </w:r>
-      <w:r>
-        <w:t xml:space="preserve">: ARC, the City of Atlanta, Central Atlanta Progress and Georgia Tech. Cleaning was the hard part. I caught one source storing local time as UTC because its “dark” field didn’t match the hour; fixing it took agreement from </w:t>
-      </w:r>
-      <w:r>
-        <w:rPr>
-          <w:b/>
-          <w:bCs/>
-        </w:rPr>
-        <w:t xml:space="preserve">60% to 94%</w:t>
-      </w:r>
-      <w:r>
-        <w:t xml:space="preserve">. Midtown’s sidewalks are mapped apart from its roads, so a third of crashes wouldn’t match any street until I modeled on road centerlines. That took matches from </w:t>
-      </w:r>
-      <w:r>
-        <w:rPr>
-          <w:b/>
-          <w:bCs/>
-        </w:rPr>
-        <w:t xml:space="preserve">66% to 96%</w:t>
-      </w:r>
-      <w:r>
-        <w:t xml:space="preserve">.</w:t>
+        <w:t xml:space="preserve">I trained on 2020 to 2023 and held out all of 2024: 543 pedestrian crashes. If Atlanta could fix only 10% of its street miles, which list catches the most crashes?</w:t>
+      </w:r>
+    </w:p>
+    <w:p>
+      <w:pPr>
+        <w:spacing w:after="120" w:line="300"/>
+      </w:pPr>
+      <w:r>
+        <w:t xml:space="preserve">Ranking by past crashes: 50%. The City’s own High Injury Network: 54%. </w:t>
+      </w:r>
+      <w:r>
+        <w:rPr>
+          <w:b/>
+          <w:bCs/>
+        </w:rPr>
+        <w:t xml:space="preserve">PathPro: 74%,</w:t>
+      </w:r>
+      <w:r>
+        <w:t xml:space="preserve"> with a confidence interval of 70 to 78. It held up on 2023 as well. Same budget, 38% more crashes reached.</w:t>
       </w:r>
     </w:p>
     <w:p>
@@ -154,7 +188,35 @@
         <w:t xml:space="preserve">0:50  </w:t>
       </w:r>
       <w:r>
-        <w:t xml:space="preserve">Modeling</w:t>
+        <w:t xml:space="preserve">Live demo</w:t>
+      </w:r>
+    </w:p>
+    <w:p>
+      <w:pPr>
+        <w:spacing w:after="80"/>
+        <w:ind w:left="284"/>
+      </w:pPr>
+      <w:r>
+        <w:rPr>
+          <w:b/>
+          <w:bCs/>
+          <w:i/>
+          <w:iCs/>
+          <w:color w:val="1F8F86"/>
+          <w:sz w:val="20"/>
+          <w:szCs w:val="20"/>
+        </w:rPr>
+        <w:t xml:space="preserve">Screen: </w:t>
+      </w:r>
+      <w:r>
+        <w:rPr>
+          <w:i/>
+          <w:iCs/>
+          <w:color w:val="1F8F86"/>
+          <w:sz w:val="20"/>
+          <w:szCs w:val="20"/>
+        </w:rPr>
+        <w:t xml:space="preserve">Risk Tides, Friday, Wet. Press play or scrub from 4 PM to 11 PM.</w:t>
       </w:r>
     </w:p>
     <w:p>
@@ -162,27 +224,86 @@
         <w:spacing w:after="120" w:line="300"/>
       </w:pPr>
       <w:r>
-        <w:t xml:space="preserve">I modeled it three ways and let the data choose: a Poisson GLM that’s easy to explain, a monotone LightGBM for accuracy, and an Empirical Bayes blend with each street’s own history, so one bad year doesn’t brand a street. A second model handles hour, darkness and rain. Every score is normalized by how many people actually walk there, with no demographic or income data. I trained on 2020 to 2023 and tested on 2024, a year it never saw. The 10% of streets PathPro flags held </w:t>
-      </w:r>
-      <w:r>
-        <w:rPr>
-          <w:b/>
-          <w:bCs/>
-        </w:rPr>
-        <w:t xml:space="preserve">74% of pedestrian crashes</w:t>
-      </w:r>
-      <w:r>
-        <w:t xml:space="preserve">; the City’s own High Injury Network got </w:t>
-      </w:r>
-      <w:r>
-        <w:rPr>
-          <w:b/>
-          <w:bCs/>
-        </w:rPr>
-        <w:t xml:space="preserve">54%</w:t>
-      </w:r>
-      <w:r>
-        <w:t xml:space="preserve">.</w:t>
+        <w:t xml:space="preserve">This is Risk Tides. Friday night, raining. Watch the corridors light up, on one fixed 0-to-100 scale for the whole city.</w:t>
+      </w:r>
+    </w:p>
+    <w:p>
+      <w:pPr>
+        <w:spacing w:after="80"/>
+        <w:ind w:left="284"/>
+      </w:pPr>
+      <w:r>
+        <w:rPr>
+          <w:b/>
+          <w:bCs/>
+          <w:i/>
+          <w:iCs/>
+          <w:color w:val="1F8F86"/>
+          <w:sz w:val="20"/>
+          <w:szCs w:val="20"/>
+        </w:rPr>
+        <w:t xml:space="preserve">Screen: </w:t>
+      </w:r>
+      <w:r>
+        <w:rPr>
+          <w:i/>
+          <w:iCs/>
+          <w:color w:val="1F8F86"/>
+          <w:sz w:val="20"/>
+          <w:szCs w:val="20"/>
+        </w:rPr>
+        <w:t xml:space="preserve">search Klaus Building → Midtown MARTA. Point at the two route cards.</w:t>
+      </w:r>
+    </w:p>
+    <w:p>
+      <w:pPr>
+        <w:spacing w:after="120" w:line="300"/>
+      </w:pPr>
+      <w:r>
+        <w:t xml:space="preserve">Now the walk a lot of us will make tonight: Klaus to Midtown MARTA. The fastest route runs down Peachtree Place and Williams Street. </w:t>
+      </w:r>
+      <w:r>
+        <w:rPr>
+          <w:b/>
+          <w:bCs/>
+        </w:rPr>
+        <w:t xml:space="preserve">PathPro’s route costs four more minutes and cuts traffic-risk exposure by 54%.</w:t>
+      </w:r>
+    </w:p>
+    <w:p>
+      <w:pPr>
+        <w:spacing w:after="80"/>
+        <w:ind w:left="284"/>
+      </w:pPr>
+      <w:r>
+        <w:rPr>
+          <w:b/>
+          <w:bCs/>
+          <w:i/>
+          <w:iCs/>
+          <w:color w:val="1F8F86"/>
+          <w:sz w:val="20"/>
+          <w:szCs w:val="20"/>
+        </w:rPr>
+        <w:t xml:space="preserve">Screen: </w:t>
+      </w:r>
+      <w:r>
+        <w:rPr>
+          <w:i/>
+          <w:iCs/>
+          <w:color w:val="1F8F86"/>
+          <w:sz w:val="20"/>
+          <w:szCs w:val="20"/>
+        </w:rPr>
+        <w:t xml:space="preserve">tap Why? on the route, then a street. Point at the factor bars.</w:t>
+      </w:r>
+    </w:p>
+    <w:p>
+      <w:pPr>
+        <w:spacing w:after="120" w:line="300"/>
+      </w:pPr>
+      <w:r>
+        <w:t xml:space="preserve">And every score shows its work. These factor bars add up exactly to the score, and Grok turns them into one plain sentence. It can’t invent a number: a validator rejects any number that isn’t in the evidence.</w:t>
       </w:r>
     </w:p>
     <w:p>
@@ -193,10 +314,101 @@
         <w:rPr>
           <w:color w:val="1F8F86"/>
         </w:rPr>
-        <w:t xml:space="preserve">1:25  </w:t>
-      </w:r>
-      <w:r>
-        <w:t xml:space="preserve">Sponsors, each with a real job</w:t>
+        <w:t xml:space="preserve">1:40  </w:t>
+      </w:r>
+      <w:r>
+        <w:t xml:space="preserve">How it works</w:t>
+      </w:r>
+    </w:p>
+    <w:p>
+      <w:pPr>
+        <w:spacing w:after="120" w:line="300"/>
+      </w:pPr>
+      <w:r>
+        <w:t xml:space="preserve">Underneath: 250,000 public crash records from eight sources. One source logged local time as UTC; I caught it by checking its “dark” field against the sun. Midtown maps sidewalks apart from roads, so I snapped crashes to road centerlines and took matches from 66% to 96%.</w:t>
+      </w:r>
+    </w:p>
+    <w:p>
+      <w:pPr>
+        <w:spacing w:after="120" w:line="300"/>
+      </w:pPr>
+      <w:r>
+        <w:t xml:space="preserve">The model is a monotone LightGBM blended with a Poisson GLM, then Empirical Bayes against each street’s own history, plus a second model for hour, darkness and rain. No demographic or income data, anywhere.</w:t>
+      </w:r>
+    </w:p>
+    <w:p>
+      <w:pPr>
+        <w:pStyle w:val="Heading2"/>
+      </w:pPr>
+      <w:r>
+        <w:rPr>
+          <w:color w:val="1F8F86"/>
+        </w:rPr>
+        <w:t xml:space="preserve">2:10  </w:t>
+      </w:r>
+      <w:r>
+        <w:t xml:space="preserve">Built to be trusted, and running live</w:t>
+      </w:r>
+    </w:p>
+    <w:p>
+      <w:pPr>
+        <w:spacing w:after="120" w:line="300"/>
+      </w:pPr>
+      <w:r>
+        <w:t xml:space="preserve">After dark you can prefer well-lit, busier streets. Crime is shown for context only and never chooses a route: a test multiplies it by a thousand, and the routes don’t change.</w:t>
+      </w:r>
+    </w:p>
+    <w:p>
+      <w:pPr>
+        <w:spacing w:after="120" w:line="300"/>
+      </w:pPr>
+      <w:r>
+        <w:t xml:space="preserve">It’s live right now at pathpro.tech (say it out loud: “path protect”) on Vultr. Tiger Data holds every street’s crash history, MongoDB holds street reports, Grok writes explanations, voice alerts and street redesigns, Gemini checks every image, and Backboard powers Ask PathPro.</w:t>
+      </w:r>
+    </w:p>
+    <w:p>
+      <w:pPr>
+        <w:pStyle w:val="Heading2"/>
+      </w:pPr>
+      <w:r>
+        <w:rPr>
+          <w:color w:val="1F8F86"/>
+        </w:rPr>
+        <w:t xml:space="preserve">2:40  </w:t>
+      </w:r>
+      <w:r>
+        <w:t xml:space="preserve">Impact and close</w:t>
+      </w:r>
+    </w:p>
+    <w:p>
+      <w:pPr>
+        <w:spacing w:after="120" w:line="300"/>
+      </w:pPr>
+      <w:r>
+        <w:t xml:space="preserve">For a person, four minutes buys half the risk. For a city, the same budget reaches 38% more crashes, and a new city needs only a boundary file and its public crash data.</w:t>
+      </w:r>
+    </w:p>
+    <w:p>
+      <w:pPr>
+        <w:spacing w:after="120" w:line="300"/>
+      </w:pPr>
+      <w:r>
+        <w:t xml:space="preserve">Other apps score risk from formulas. PathPro was tested on a year it never saw, and it beat the City’s own list. </w:t>
+      </w:r>
+      <w:r>
+        <w:rPr>
+          <w:b/>
+          <w:bCs/>
+        </w:rPr>
+        <w:t xml:space="preserve">PathPro. See the risks on your way, before you go.</w:t>
+      </w:r>
+    </w:p>
+    <w:p>
+      <w:pPr>
+        <w:pStyle w:val="Heading3"/>
+      </w:pPr>
+      <w:r>
+        <w:t xml:space="preserve">What each judge should hear</w:t>
       </w:r>
     </w:p>
     <w:p>
@@ -213,10 +425,10 @@
           <w:b/>
           <w:bCs/>
         </w:rPr>
-        <w:t xml:space="preserve">Vultr</w:t>
-      </w:r>
-      <w:r>
-        <w:t xml:space="preserve"> runs everything on one VM in Atlanta.</w:t>
+        <w:t xml:space="preserve">Oracle of the Deep (ML + visualization): </w:t>
+      </w:r>
+      <w:r>
+        <w:t xml:space="preserve">the 2024 holdout at 0:20, Risk Tides at 0:50, the model at 1:40.</w:t>
       </w:r>
     </w:p>
     <w:p>
@@ -233,10 +445,10 @@
           <w:b/>
           <w:bCs/>
         </w:rPr>
-        <w:t xml:space="preserve">pathpro.tech</w:t>
-      </w:r>
-      <w:r>
-        <w:t xml:space="preserve">: say it out loud, “path protect.”</w:t>
+        <w:t xml:space="preserve">Aramco, A Marina’s Mission (social good): </w:t>
+      </w:r>
+      <w:r>
+        <w:t xml:space="preserve">38% more crashes reached on the same budget; crime never routes; no demographic data.</w:t>
       </w:r>
     </w:p>
     <w:p>
@@ -253,10 +465,18 @@
           <w:b/>
           <w:bCs/>
         </w:rPr>
-        <w:t xml:space="preserve">Tiger Data</w:t>
-      </w:r>
-      <w:r>
-        <w:t xml:space="preserve"> turns 220,000 crash rows into an hourly chart for every street.</w:t>
+        <w:t xml:space="preserve">SpaceXAI, Make it Legendary: </w:t>
+      </w:r>
+      <w:r>
+        <w:t xml:space="preserve">Grok explains every score without inventing a number, speaks the alerts and draws the redesigns.</w:t>
+      </w:r>
+    </w:p>
+    <w:p>
+      <w:pPr>
+        <w:pStyle w:val="Heading3"/>
+      </w:pPr>
+      <w:r>
+        <w:t xml:space="preserve">Delivery</w:t>
       </w:r>
     </w:p>
     <w:p>
@@ -269,14 +489,17 @@
         <w:spacing w:after="60" w:line="290"/>
       </w:pPr>
       <w:r>
-        <w:rPr>
-          <w:b/>
-          <w:bCs/>
-        </w:rPr>
-        <w:t xml:space="preserve">MongoDB Atlas</w:t>
-      </w:r>
-      <w:r>
-        <w:t xml:space="preserve"> holds street reports and shared walks that expire on their own.</w:t>
+        <w:t xml:space="preserve">Have the app open on Risk Tides, Friday, Wet, before you start. Have </w:t>
+      </w:r>
+      <w:r>
+        <w:rPr>
+          <w:b/>
+          <w:bCs/>
+        </w:rPr>
+        <w:t xml:space="preserve">?demo=1</w:t>
+      </w:r>
+      <w:r>
+        <w:t xml:space="preserve"> loaded in a second tab in case the Wi-Fi drops.</w:t>
       </w:r>
     </w:p>
     <w:p>
@@ -289,24 +512,7 @@
         <w:spacing w:after="60" w:line="290"/>
       </w:pPr>
       <w:r>
-        <w:rPr>
-          <w:b/>
-          <w:bCs/>
-        </w:rPr>
-        <w:t xml:space="preserve">Grok</w:t>
-      </w:r>
-      <w:r>
-        <w:t xml:space="preserve"> explains every score and can’t invent a number, and speaks your alerts. </w:t>
-      </w:r>
-      <w:r>
-        <w:rPr>
-          <w:b/>
-          <w:bCs/>
-        </w:rPr>
-        <w:t xml:space="preserve">Grok Imagine</w:t>
-      </w:r>
-      <w:r>
-        <w:t xml:space="preserve"> draws the redesign a planner could build.</w:t>
+        <w:t xml:space="preserve">Say the three baseline numbers slowly: 50, 54, 74. That comparison is the pitch; pause after 74.</w:t>
       </w:r>
     </w:p>
     <w:p>
@@ -319,14 +525,7 @@
         <w:spacing w:after="60" w:line="290"/>
       </w:pPr>
       <w:r>
-        <w:rPr>
-          <w:b/>
-          <w:bCs/>
-        </w:rPr>
-        <w:t xml:space="preserve">Gemini</w:t>
-      </w:r>
-      <w:r>
-        <w:t xml:space="preserve"> checks every picture before anyone sees it.</w:t>
+        <w:t xml:space="preserve">Short on time? Cut the sidewalk sentence at 1:40 and the sponsor list at 2:10 down to “live on Vultr at pathpro.tech”.</w:t>
       </w:r>
     </w:p>
     <w:p>
@@ -339,14 +538,15 @@
         <w:spacing w:after="60" w:line="290"/>
       </w:pPr>
       <w:r>
-        <w:rPr>
-          <w:b/>
-          <w:bCs/>
-        </w:rPr>
-        <w:t xml:space="preserve">Ask PathPro on Backboard</w:t>
-      </w:r>
-      <w:r>
-        <w:t xml:space="preserve"> answers questions about the street on your screen, and remembers how you travel only if you opt in.</w:t>
+        <w:t xml:space="preserve">Always say “traffic risk” and “lower-risk”, never “safe” or “safest”.</w:t>
+      </w:r>
+    </w:p>
+    <w:p>
+      <w:pPr>
+        <w:pStyle w:val="Heading3"/>
+      </w:pPr>
+      <w:r>
+        <w:t xml:space="preserve">Likely follow-up questions</w:t>
       </w:r>
     </w:p>
     <w:p>
@@ -363,108 +563,90 @@
           <w:b/>
           <w:bCs/>
         </w:rPr>
-        <w:t xml:space="preserve">ElevenLabs</w:t>
-      </w:r>
-      <w:r>
-        <w:t xml:space="preserve"> is the backup voice, so alerts never go silent.</w:t>
-      </w:r>
-    </w:p>
-    <w:p>
-      <w:pPr>
-        <w:pStyle w:val="Heading2"/>
-      </w:pPr>
-      <w:r>
-        <w:rPr>
-          <w:color w:val="1F8F86"/>
-        </w:rPr>
-        <w:t xml:space="preserve">2:05  </w:t>
-      </w:r>
-      <w:r>
-        <w:t xml:space="preserve">Impact</w:t>
-      </w:r>
-    </w:p>
-    <w:p>
-      <w:pPr>
-        <w:spacing w:after="120" w:line="300"/>
-      </w:pPr>
-      <w:r>
-        <w:t xml:space="preserve">For a person, four extra minutes cuts traffic-risk exposure by more than half. For a city, the same budget spent on 10% of streets reaches </w:t>
-      </w:r>
-      <w:r>
-        <w:rPr>
-          <w:b/>
-          <w:bCs/>
-        </w:rPr>
-        <w:t xml:space="preserve">38% more</w:t>
-      </w:r>
-      <w:r>
-        <w:t xml:space="preserve"> of next year’s pedestrian crashes. That’s Aramco’s mission: social good you can measure. After dark it adds well-lit routes and Share my walk. Crime is shown for context and never used to route, so no neighborhood gets labeled.</w:t>
-      </w:r>
-    </w:p>
-    <w:p>
-      <w:pPr>
-        <w:pStyle w:val="Heading2"/>
-      </w:pPr>
-      <w:r>
-        <w:rPr>
-          <w:color w:val="1F8F86"/>
-        </w:rPr>
-        <w:t xml:space="preserve">2:30  </w:t>
-      </w:r>
-      <w:r>
-        <w:t xml:space="preserve">Why it matters here</w:t>
-      </w:r>
-    </w:p>
-    <w:p>
-      <w:pPr>
-        <w:spacing w:after="120" w:line="300"/>
-      </w:pPr>
-      <w:r>
-        <w:t xml:space="preserve">This started on this campus, on the walks we all make after a hackathon night like this one.</w:t>
-      </w:r>
-    </w:p>
-    <w:p>
-      <w:pPr>
-        <w:pStyle w:val="Heading2"/>
-      </w:pPr>
-      <w:r>
-        <w:rPr>
-          <w:color w:val="1F8F86"/>
-        </w:rPr>
-        <w:t xml:space="preserve">2:40  </w:t>
-      </w:r>
-      <w:r>
-        <w:t xml:space="preserve">The product</w:t>
-      </w:r>
-    </w:p>
-    <w:p>
-      <w:pPr>
-        <w:spacing w:after="120" w:line="300"/>
-      </w:pPr>
-      <w:r>
-        <w:t xml:space="preserve">As a product: a free app for anyone walking or riding, and a planning tool sold to cities, campuses and scooter operators. A new city needs one boundary file and its public crash data.</w:t>
-      </w:r>
-    </w:p>
-    <w:p>
-      <w:pPr>
-        <w:pStyle w:val="Heading2"/>
-      </w:pPr>
-      <w:r>
-        <w:rPr>
-          <w:color w:val="1F8F86"/>
-        </w:rPr>
-        <w:t xml:space="preserve">2:55  </w:t>
-      </w:r>
-      <w:r>
-        <w:t xml:space="preserve">Close</w:t>
-      </w:r>
-    </w:p>
-    <w:p>
-      <w:pPr>
-        <w:spacing w:after="120" w:line="300"/>
-      </w:pPr>
-      <w:r>
-        <w:t xml:space="preserve">PathPro. See the risks on your way, before you go.</w:t>
+        <w:t xml:space="preserve">“Isn’t this just last year’s hotspots?” </w:t>
+      </w:r>
+      <w:r>
+        <w:t xml:space="preserve">No. Ranking by past crashes caught 49.8% in 2024; PathPro caught 74.3%. Traffic volume, speed, lanes, foot traffic and transit let a street rank high before it has a crash history.</w:t>
+      </w:r>
+    </w:p>
+    <w:p>
+      <w:pPr>
+        <w:pStyle w:val="ListParagraph"/>
+        <w:numPr>
+          <w:ilvl w:val="0"/>
+          <w:numId w:val="2"/>
+        </w:numPr>
+        <w:spacing w:after="60" w:line="290"/>
+      </w:pPr>
+      <w:r>
+        <w:rPr>
+          <w:b/>
+          <w:bCs/>
+        </w:rPr>
+        <w:t xml:space="preserve">“How do you know it didn’t leak?” </w:t>
+      </w:r>
+      <w:r>
+        <w:t xml:space="preserve">Crash-history features are rebuilt for each training window, cross-validation is grouped by roughly 5 km² areas, and the interval comes from 400 resamples of 614 spatial blocks.</w:t>
+      </w:r>
+    </w:p>
+    <w:p>
+      <w:pPr>
+        <w:pStyle w:val="ListParagraph"/>
+        <w:numPr>
+          <w:ilvl w:val="0"/>
+          <w:numId w:val="2"/>
+        </w:numPr>
+        <w:spacing w:after="60" w:line="290"/>
+      </w:pPr>
+      <w:r>
+        <w:rPr>
+          <w:b/>
+          <w:bCs/>
+        </w:rPr>
+        <w:t xml:space="preserve">“Why a ranking, not crash counts?” </w:t>
+      </w:r>
+      <w:r>
+        <w:t xml:space="preserve">2024 recorded more pedestrian crashes than earlier years, so PathPro claims ranking, not calibrated counts.</w:t>
+      </w:r>
+    </w:p>
+    <w:p>
+      <w:pPr>
+        <w:pStyle w:val="ListParagraph"/>
+        <w:numPr>
+          <w:ilvl w:val="0"/>
+          <w:numId w:val="2"/>
+        </w:numPr>
+        <w:spacing w:after="60" w:line="290"/>
+      </w:pPr>
+      <w:r>
+        <w:rPr>
+          <w:b/>
+          <w:bCs/>
+        </w:rPr>
+        <w:t xml:space="preserve">“How is this different from a safety app?” </w:t>
+      </w:r>
+      <w:r>
+        <w:t xml:space="preserve">It predicts real crash outcomes and is tested on a year it never saw. Crime is never in the model or in routing, so it doesn’t label neighborhoods.</w:t>
+      </w:r>
+    </w:p>
+    <w:p>
+      <w:pPr>
+        <w:pStyle w:val="ListParagraph"/>
+        <w:numPr>
+          <w:ilvl w:val="0"/>
+          <w:numId w:val="2"/>
+        </w:numPr>
+        <w:spacing w:after="60" w:line="290"/>
+      </w:pPr>
+      <w:r>
+        <w:rPr>
+          <w:b/>
+          <w:bCs/>
+        </w:rPr>
+        <w:t xml:space="preserve">“Can the AI make things up?” </w:t>
+      </w:r>
+      <w:r>
+        <w:t xml:space="preserve">The LLM never produces a score. Any sentence with a number that isn’t in the evidence is rejected, and a fixed template takes over.</w:t>
       </w:r>
     </w:p>
     <w:p>
@@ -474,21 +656,6 @@
         </w:pBdr>
         <w:spacing w:after="200"/>
       </w:pPr>
-    </w:p>
-    <w:p>
-      <w:pPr>
-        <w:spacing w:after="160"/>
-      </w:pPr>
-      <w:r>
-        <w:rPr>
-          <w:i/>
-          <w:iCs/>
-          <w:color w:val="5B6B78"/>
-          <w:sz w:val="20"/>
-          <w:szCs w:val="20"/>
-        </w:rPr>
-        <w:t xml:space="preserve">Delivery: point at the live app during the data and sponsor sections. If you’re short on time, cut the cyclist numbers and the ElevenLabs line.</w:t>
-      </w:r>
     </w:p>
     <w:p>
       <w:r>
@@ -5363,7 +5530,7 @@
                 <w:sz w:val="19"/>
                 <w:szCs w:val="19"/>
               </w:rPr>
-              <w:t xml:space="preserve">237 data · 695 API · 658 web · 19 end-to-end</w:t>
+              <w:t xml:space="preserve">237 data · 695 API · 663 web · 19 end-to-end</w:t>
             </w:r>
           </w:p>
         </w:tc>

</xml_diff>